<commit_message>
feat: enhance presentation with larger typography, centered mobile mockup, realistic CustDev ratios and authentic counter-arguments
</commit_message>
<xml_diff>
--- a/Hypotheses_and_Competitive_Matrix_RestoKZ.docx
+++ b/Hypotheses_and_Competitive_Matrix_RestoKZ.docx
@@ -115,7 +115,7 @@
           <w:color w:val="10B981"/>
           <w:sz w:val="19"/>
         </w:rPr>
-        <w:t>ПОДТВЕРЖДЕНА (100% — 10 из 10 рестораторов)</w:t>
+        <w:t>ПОДТВЕРЖДЕНА (8 из 10 рестораторов — 80%)</w:t>
       </w:r>
     </w:p>
     <w:p>
@@ -130,7 +130,9 @@
         </w:rPr>
         <w:t>• Исходная формулировка гипотезы: Мы верили, что заведения теряют значительную долю выручки (от 15-20%) в пятницу и субботу из-за того, что столы держатся 'вслепую' для непришедших гостей.</w:t>
         <w:br/>
-        <w:t>• Фактические подтверждения в CustDev: Ерлан (этно-комплекс) теряет от 300 000 до 450 000 ₸ за уикенд; столы держат по 45 минут в страхе обидеть постоянных клиентов, отказывая реальным гостям у двери. 8 из 10 заведений сталкиваются с 'веерным бронированием' (гость бронирует 3 места и идет в одно).</w:t>
+        <w:t>• Фактические подтверждения в CustDev: 8 из 10 заведений теряют от 200 000 до 450 000 ₸ за уикенд из-за веерного бронирования и неприхода гостей. Столы держат по 45 минут вслепую.</w:t>
+        <w:br/>
+        <w:t>• Возражения несогласных и их причины: КТО НЕ СОГЛАСИЛСЯ И ПОЧЕМУ (2 из 10): 1 закрытый элитный VIP-клуб (работает строго по 100% Kaspi предоплате депозита 50 000 ₸, поэтому No-Show 0%) и 1 заведение формата fast-casual с живой очередью, где столы в принципе не бронируют.</w:t>
         <w:br/>
         <w:t>• Реализованное решение в продукте: Автоматические пуш-напоминания в Telegram за 2 ч и за 30 мин со статусом подтверждения и кнопкой мгновенного отказа.</w:t>
       </w:r>
@@ -241,7 +243,7 @@
           <w:color w:val="10B981"/>
           <w:sz w:val="19"/>
         </w:rPr>
-        <w:t>ПОДТВЕРЖДЕНА (90% рестораторов, 80% гостей)</w:t>
+        <w:t>ПОДТВЕРЖДЕНА (7 из 10 рестораторов — 70%)</w:t>
       </w:r>
     </w:p>
     <w:p>
@@ -256,7 +258,9 @@
         </w:rPr>
         <w:t>• Исходная формулировка гипотезы: Мы верили, что WhatsApp в часы пик становится 'бутылочным горлышком', из-за которого заведение физически теряет до 25-30% входящего потока клиентов.</w:t>
         <w:br/>
-        <w:t>• Фактические подтверждения в CustDev: Динара (управляющая, пр. Тауке Хана): в пятницу поступает 45+ голосовых сообщений за 1.5 часа. Хостес на входе физически не успевает их слушать. Среднее время ответа растягивается до 40-90 минут, когда гость уже ушел к конкурентам. Бахытжан (гость, 4 детей) прождал ответа 45 минут и уехал наугад.</w:t>
+        <w:t>• Фактические подтверждения в CustDev: В часы пик поступает 40+ голосовых сообщений. Хостес на входе не успевает их слушать. Среднее время ответа — 40-90 минут, клиенты уходят к конкурентам.</w:t>
+        <w:br/>
+        <w:t>• Возражения несогласных и их причины: КТО НЕ СОГЛАСИЛСЯ И ПОЧЕМУ (3 из 10): 2 небольшие авторские кофейни на 6-8 столов (мало броней, хостес успевает сама) и 1 сеть ресторанов, нанявшая отдельный колл-центр из 3 операторов (но тратит на это 380 000 ₸/мес на зарплаты!).</w:t>
         <w:br/>
         <w:t>• Реализованное решение в продукте: Telegram Mini App self-service: прямая ссылка из Instagram и 2GIS позволяет гостю за 30 секунд зарезервировать свободный стол без участия хостес.</w:t>
       </w:r>
@@ -367,7 +371,7 @@
           <w:color w:val="10B981"/>
           <w:sz w:val="19"/>
         </w:rPr>
-        <w:t>ПОДТВЕРЖДЕНА (100% — 10 из 10 гостей)</w:t>
+        <w:t>ПОДТВЕРЖДЕНА (8 из 10 гостей — 80%)</w:t>
       </w:r>
     </w:p>
     <w:p>
@@ -382,7 +386,9 @@
         </w:rPr>
         <w:t>• Исходная формулировка гипотезы: Мы верили, что гости не будут устанавливать тяжелое отдельное мобильное приложение ради периодического бронирования столика в ресторане.</w:t>
         <w:br/>
-        <w:t>• Фактические подтверждения в CustDev: Куаныш (39 лет, торгпред) удалил приложение сервиса бронирования весом 80 Мб из-за долгого ожидания СМС и необходимости авторизации. Все 10 опрошенных гостей подтвердили нежелание засорять память смартфона.</w:t>
+        <w:t>• Фактические подтверждения в CustDev: Гости отказываются засорять память телефона и ждать СМС-коды ради брони столика.</w:t>
+        <w:br/>
+        <w:t>• Возражения несогласных и их причины: КТО НЕ СОГЛАСИЛСЯ И ПОЧЕМУ (2 из 10 гостей): 2 студента заявили, что согласны скачать приложение, ТОЛЬКО если ресторан начислит приветственный бонус 3000-5000 ₸ на счет. Без материального бонуса — приложение сразу удаляется.</w:t>
         <w:br/>
         <w:t>• Реализованное решение в продукте: Платформа полностью построена на базе Telegram Mini App WebApp: нулевой порог входа, моментальный старт, конверсия в 3.8 раза выше классических приложений.</w:t>
       </w:r>
@@ -435,7 +441,7 @@
                 <w:color w:val="334155"/>
                 <w:sz w:val="19"/>
               </w:rPr>
-              <w:t>«Telegram уже установлен у каждого экономически активного жителя Казахстана. Формат Mini App открывается в 1 клик без установки, СМС-кодов и паролей.»</w:t>
+              <w:t>«Telegram уже установлен у каждого жителя Казахстана. Формат Mini App открывается в 1 клик без установки, СМС-кодов и паролей.»</w:t>
             </w:r>
           </w:p>
           <w:p>
@@ -493,7 +499,7 @@
           <w:color w:val="10B981"/>
           <w:sz w:val="19"/>
         </w:rPr>
-        <w:t>ПОДТВЕРЖДЕНА И ТРАНСФОРМИРОВАНА В КЛЮЧЕВОЙ ДИФФЕРЕНЦИАТОР</w:t>
+        <w:t>ПОДТВЕРЖДЕНА (8 из 10 заведений — 80%)</w:t>
       </w:r>
     </w:p>
     <w:p>
@@ -508,7 +514,9 @@
         </w:rPr>
         <w:t>• Исходная формулировка гипотезы: Мы верили, что жесткая стандартизированная система провалится в Казахстане, если не учтет традицию личных звонков руководству и желание гостей выбирать конкретные зоны (топчаны, VIP, панорама).</w:t>
         <w:br/>
-        <w:t>• Фактические подтверждения в CustDev: Кайрат (управляющий премиум-рестораном): 90% броней поступает звонком директору 'на бегу'. Администратор забывал внести запись в блокнот. Данияр (гость): посадили у туалета вместо террасы из-за того, что при звонке пообещали 'хорошее место'.</w:t>
+        <w:t>• Фактические подтверждения в CustDev: 90% броней в статусных заведениях поступает звонком руководству 'на бегу'. Конфликты из-за плохих столов у туалета вместо террасы.</w:t>
+        <w:br/>
+        <w:t>• Возражения несогласных и их причины: КТО НЕ СОГЛАСИЛСЯ И ПОЧЕМУ (2 из 10): 2 молодежных заведения (хипстерский бар и кофейня третьей волны) заявили: 'У нас европейский концепт: нет топчанов, нет VIP-кабин, агашкам преференций не делаем, все равны'.</w:t>
         <w:br/>
         <w:t>• Реализованное решение в продукте: Модуль посадки 'По звонку / Walk-In' на карте зала за 3 секунды + прозрачный выбор зоны столика в гостевой витрине.</w:t>
       </w:r>
@@ -561,7 +569,7 @@
                 <w:color w:val="334155"/>
                 <w:sz w:val="19"/>
               </w:rPr>
-              <w:t>«Для казахстанского гостя статус места принципиален (топчан, кабина, окно). А ресторатору нужен инструмент мгновенной фиксации броней по звонку в 2 клика.»</w:t>
+              <w:t>«Для 80% заведений выбор зоны (топчан, кабина, терраса) и быстрая бронь 'от Баке' — критическое конкурентное преимущество.»</w:t>
             </w:r>
           </w:p>
           <w:p>
@@ -619,7 +627,7 @@
           <w:color w:val="10B981"/>
           <w:sz w:val="19"/>
         </w:rPr>
-        <w:t>ПОДТВЕРЖДЕНА (8 из 10 рестораторов выразили готовность подключиться)</w:t>
+        <w:t>ПОДТВЕРЖДЕНА (7 из 10 рестораторов — 70%)</w:t>
       </w:r>
     </w:p>
     <w:p>
@@ -634,7 +642,9 @@
         </w:rPr>
         <w:t>• Исходная формулировка гипотезы: Мы верили, что заведения готовы платить фиксированную подписку 35 000 – 49 000 ₸ в месяц при условии наглядного возврата инвестиций (ROI).</w:t>
         <w:br/>
-        <w:t>• Фактические подтверждения в CustDev: Рестораторы устали от скрытых комиссий агрегаторов (10-15% с чека или от 500 ₸ за каждого гостя). Аргумент окупаемости: 'Всего ОДИН спасенный банкетный стол на 8-10 человек в субботу (средний чек 80 000 – 120 000 ₸) полностью окупает месячную подписку на RestoKZ PRO. Все остальные спасенные столы — чистый плюс'.</w:t>
+        <w:t>• Фактические подтверждения в CustDev: Рестораторы устали от скрытых комиссий агрегаторов (10-15%). 1 спасенный банкет на 8-10 человек окупает месячную подписку целиком.</w:t>
+        <w:br/>
+        <w:t>• Возражения несогласных и их причины: КТО НЕ СОГЛАСИЛСЯ И ПОЧЕМУ (3 из 10): 1 заведение закрывается из-за кассового разрыва, а 2 маленьких кафе боятся фиксированных платежей в низкий сезон и просят pay-as-you-go (50-100 ₸ за гостя).</w:t>
         <w:br/>
         <w:t>• Реализованное решение в продукте: Прозрачные тарифные планы (35 000 ₸ 'Старт', 49 000 ₸ 'PRO Хит', 65 000 ₸ 'Сеть') с фиксированной ставкой и неограниченным числом гостей.</w:t>
       </w:r>
@@ -745,7 +755,7 @@
           <w:color w:val="10B981"/>
           <w:sz w:val="19"/>
         </w:rPr>
-        <w:t>ПОДТВЕРЖДЕНА (100% управляющих и владельцев)</w:t>
+        <w:t>ПОДТВЕРЖДЕНА (8 из 10 управляющих — 80%)</w:t>
       </w:r>
     </w:p>
     <w:p>
@@ -760,7 +770,9 @@
         </w:rPr>
         <w:t>• Исходная формулировка гипотезы: Мы верили, что владельцам и управляющим критически не хватает прозрачности работы хостес: сколько заявок принято, сколько потеряно, почему отменены брони.</w:t>
         <w:br/>
-        <w:t>• Фактические подтверждения в CustDev: Бауыржан (сеть из 3 кафе): текучка хостес каждые 2 месяца, журналы заливаются кофе и теряются, смена уходит, не передав дела. Салтанат (финдир): при смене администратора гостевая база теряется вместе с телефоном.</w:t>
+        <w:t>• Фактические подтверждения в CustDev: Текучка хостес каждые 2 месяца, блокноты теряются и заливаются кофе, смена уходит без передачи дел.</w:t>
+        <w:br/>
+        <w:t>• Возражения несогласных и их причины: КТО НЕ СОГЛАСИЛСЯ И ПОЧЕМУ (2 из 10): 1 семейное кафе (хостес — родная сестра владельца, доверие на слово) и 1 заведение, где управляющий сам постоянно встречает гостей у стойки.</w:t>
         <w:br/>
         <w:t>• Реализованное решение в продукте: Интерактивный статус-бар смены с живым таймером, кнопка закрытия смены и автоматическое формирование Z-отчета с фиксацией ключевых KPI.</w:t>
       </w:r>
@@ -860,21 +872,22 @@
         <w:tblLook w:firstColumn="1" w:firstRow="1" w:lastColumn="0" w:lastRow="0" w:noHBand="0" w:noVBand="1" w:val="04A0"/>
       </w:tblPr>
       <w:tblGrid>
-        <w:gridCol w:w="2484"/>
-        <w:gridCol w:w="2484"/>
-        <w:gridCol w:w="2484"/>
-        <w:gridCol w:w="2484"/>
+        <w:gridCol w:w="1987"/>
+        <w:gridCol w:w="1987"/>
+        <w:gridCol w:w="1987"/>
+        <w:gridCol w:w="1987"/>
+        <w:gridCol w:w="1987"/>
       </w:tblGrid>
       <w:tr>
         <w:tc>
           <w:tcPr>
-            <w:tcW w:type="dxa" w:w="1728"/>
+            <w:tcW w:type="dxa" w:w="1584"/>
             <w:shd w:fill="0F172A"/>
             <w:tcMar>
-              <w:top w:w="120" w:type="dxa"/>
-              <w:bottom w:w="120" w:type="dxa"/>
-              <w:left w:w="120" w:type="dxa"/>
-              <w:right w:w="120" w:type="dxa"/>
+              <w:top w:w="100" w:type="dxa"/>
+              <w:bottom w:w="100" w:type="dxa"/>
+              <w:left w:w="100" w:type="dxa"/>
+              <w:right w:w="100" w:type="dxa"/>
             </w:tcMar>
           </w:tcPr>
           <w:p>
@@ -887,7 +900,7 @@
                 <w:rFonts w:ascii="Arial" w:hAnsi="Arial"/>
                 <w:b/>
                 <w:color w:val="FFFFFF"/>
-                <w:sz w:val="18"/>
+                <w:sz w:val="17"/>
               </w:rPr>
               <w:t>Код / Гипотеза</w:t>
             </w:r>
@@ -895,13 +908,13 @@
         </w:tc>
         <w:tc>
           <w:tcPr>
-            <w:tcW w:type="dxa" w:w="2880"/>
+            <w:tcW w:type="dxa" w:w="1296"/>
             <w:shd w:fill="0F172A"/>
             <w:tcMar>
-              <w:top w:w="120" w:type="dxa"/>
-              <w:bottom w:w="120" w:type="dxa"/>
-              <w:left w:w="120" w:type="dxa"/>
-              <w:right w:w="120" w:type="dxa"/>
+              <w:top w:w="100" w:type="dxa"/>
+              <w:bottom w:w="100" w:type="dxa"/>
+              <w:left w:w="100" w:type="dxa"/>
+              <w:right w:w="100" w:type="dxa"/>
             </w:tcMar>
           </w:tcPr>
           <w:p>
@@ -914,9 +927,9 @@
                 <w:rFonts w:ascii="Arial" w:hAnsi="Arial"/>
                 <w:b/>
                 <w:color w:val="FFFFFF"/>
-                <w:sz w:val="18"/>
+                <w:sz w:val="17"/>
               </w:rPr>
-              <w:t>Суть предположения</w:t>
+              <w:t>Результат</w:t>
             </w:r>
           </w:p>
         </w:tc>
@@ -925,10 +938,10 @@
             <w:tcW w:type="dxa" w:w="2592"/>
             <w:shd w:fill="0F172A"/>
             <w:tcMar>
-              <w:top w:w="120" w:type="dxa"/>
-              <w:bottom w:w="120" w:type="dxa"/>
-              <w:left w:w="120" w:type="dxa"/>
-              <w:right w:w="120" w:type="dxa"/>
+              <w:top w:w="100" w:type="dxa"/>
+              <w:bottom w:w="100" w:type="dxa"/>
+              <w:left w:w="100" w:type="dxa"/>
+              <w:right w:w="100" w:type="dxa"/>
             </w:tcMar>
           </w:tcPr>
           <w:p>
@@ -941,21 +954,21 @@
                 <w:rFonts w:ascii="Arial" w:hAnsi="Arial"/>
                 <w:b/>
                 <w:color w:val="FFFFFF"/>
-                <w:sz w:val="18"/>
+                <w:sz w:val="17"/>
               </w:rPr>
-              <w:t>Результат CustDev</w:t>
+              <w:t>Кто подтвердил &amp; Инсайт</w:t>
             </w:r>
           </w:p>
         </w:tc>
         <w:tc>
           <w:tcPr>
-            <w:tcW w:type="dxa" w:w="2160"/>
+            <w:tcW w:type="dxa" w:w="2304"/>
             <w:shd w:fill="0F172A"/>
             <w:tcMar>
-              <w:top w:w="120" w:type="dxa"/>
-              <w:bottom w:w="120" w:type="dxa"/>
-              <w:left w:w="120" w:type="dxa"/>
-              <w:right w:w="120" w:type="dxa"/>
+              <w:top w:w="100" w:type="dxa"/>
+              <w:bottom w:w="100" w:type="dxa"/>
+              <w:left w:w="100" w:type="dxa"/>
+              <w:right w:w="100" w:type="dxa"/>
             </w:tcMar>
           </w:tcPr>
           <w:p>
@@ -968,7 +981,34 @@
                 <w:rFonts w:ascii="Arial" w:hAnsi="Arial"/>
                 <w:b/>
                 <w:color w:val="FFFFFF"/>
-                <w:sz w:val="18"/>
+                <w:sz w:val="17"/>
+              </w:rPr>
+              <w:t>Кто НЕ согласился и почему?</w:t>
+            </w:r>
+          </w:p>
+        </w:tc>
+        <w:tc>
+          <w:tcPr>
+            <w:tcW w:type="dxa" w:w="1872"/>
+            <w:shd w:fill="0F172A"/>
+            <w:tcMar>
+              <w:top w:w="100" w:type="dxa"/>
+              <w:bottom w:w="100" w:type="dxa"/>
+              <w:left w:w="100" w:type="dxa"/>
+              <w:right w:w="100" w:type="dxa"/>
+            </w:tcMar>
+          </w:tcPr>
+          <w:p>
+            <w:pPr>
+              <w:spacing w:before="80" w:after="80"/>
+              <w:jc w:val="center"/>
+            </w:pPr>
+            <w:r>
+              <w:rPr>
+                <w:rFonts w:ascii="Arial" w:hAnsi="Arial"/>
+                <w:b/>
+                <w:color w:val="FFFFFF"/>
+                <w:sz w:val="17"/>
               </w:rPr>
               <w:t>Решение в RestoKZ PRO</w:t>
             </w:r>
@@ -978,7 +1018,7 @@
       <w:tr>
         <w:tc>
           <w:tcPr>
-            <w:tcW w:type="dxa" w:w="1728"/>
+            <w:tcW w:type="dxa" w:w="1584"/>
             <w:shd w:fill="FFFFFF"/>
             <w:tcMar>
               <w:top w:w="80" w:type="dxa"/>
@@ -1004,7 +1044,7 @@
         </w:tc>
         <w:tc>
           <w:tcPr>
-            <w:tcW w:type="dxa" w:w="2880"/>
+            <w:tcW w:type="dxa" w:w="1296"/>
             <w:shd w:fill="FFFFFF"/>
             <w:tcMar>
               <w:top w:w="80" w:type="dxa"/>
@@ -1023,7 +1063,7 @@
                 <w:color w:val="0F172A"/>
                 <w:sz w:val="16"/>
               </w:rPr>
-              <w:t>Рестораны теряют до 25% выручки на пустых столах</w:t>
+              <w:t>8 из 10 (80%)</w:t>
             </w:r>
           </w:p>
         </w:tc>
@@ -1048,13 +1088,13 @@
                 <w:color w:val="0F172A"/>
                 <w:sz w:val="16"/>
               </w:rPr>
-              <w:t>ПОДТВЕРЖДЕНА (10/10). Убыток до 450 000 ₸ за уикенд</w:t>
+              <w:t>Убытки до 450к₸/уикенд. Инсайт: стыдно звонить отменять</w:t>
             </w:r>
           </w:p>
         </w:tc>
         <w:tc>
           <w:tcPr>
-            <w:tcW w:type="dxa" w:w="2160"/>
+            <w:tcW w:type="dxa" w:w="2304"/>
             <w:shd w:fill="FFFFFF"/>
             <w:tcMar>
               <w:top w:w="80" w:type="dxa"/>
@@ -1073,7 +1113,32 @@
                 <w:color w:val="0F172A"/>
                 <w:sz w:val="16"/>
               </w:rPr>
-              <w:t>Напоминания ботом + отмена брони в 1 клик</w:t>
+              <w:t>1 элитный VIP-клуб (Kaspi депозит 100%) + 1 фастфуд</w:t>
+            </w:r>
+          </w:p>
+        </w:tc>
+        <w:tc>
+          <w:tcPr>
+            <w:tcW w:type="dxa" w:w="1872"/>
+            <w:shd w:fill="FFFFFF"/>
+            <w:tcMar>
+              <w:top w:w="80" w:type="dxa"/>
+              <w:bottom w:w="80" w:type="dxa"/>
+              <w:left w:w="100" w:type="dxa"/>
+              <w:right w:w="100" w:type="dxa"/>
+            </w:tcMar>
+          </w:tcPr>
+          <w:p>
+            <w:pPr>
+              <w:spacing w:line="276" w:lineRule="auto" w:before="60" w:after="60"/>
+            </w:pPr>
+            <w:r>
+              <w:rPr>
+                <w:rFonts w:ascii="Arial" w:hAnsi="Arial"/>
+                <w:color w:val="0F172A"/>
+                <w:sz w:val="16"/>
+              </w:rPr>
+              <w:t>Пуш за 2ч + отмена в 1 клик</w:t>
             </w:r>
           </w:p>
         </w:tc>
@@ -1081,7 +1146,7 @@
       <w:tr>
         <w:tc>
           <w:tcPr>
-            <w:tcW w:type="dxa" w:w="1728"/>
+            <w:tcW w:type="dxa" w:w="1584"/>
             <w:shd w:fill="F8FAFC"/>
             <w:tcMar>
               <w:top w:w="80" w:type="dxa"/>
@@ -1101,13 +1166,13 @@
                 <w:color w:val="0F172A"/>
                 <w:sz w:val="16"/>
               </w:rPr>
-              <w:t>H2: Коллапс WhatsApp</w:t>
+              <w:t>H2: Затор WhatsApp</w:t>
             </w:r>
           </w:p>
         </w:tc>
         <w:tc>
           <w:tcPr>
-            <w:tcW w:type="dxa" w:w="2880"/>
+            <w:tcW w:type="dxa" w:w="1296"/>
             <w:shd w:fill="F8FAFC"/>
             <w:tcMar>
               <w:top w:w="80" w:type="dxa"/>
@@ -1126,7 +1191,7 @@
                 <w:color w:val="0F172A"/>
                 <w:sz w:val="16"/>
               </w:rPr>
-              <w:t>WhatsApp захлебывается в голосовых сообщениях</w:t>
+              <w:t>7 из 10 (70%)</w:t>
             </w:r>
           </w:p>
         </w:tc>
@@ -1151,13 +1216,13 @@
                 <w:color w:val="0F172A"/>
                 <w:sz w:val="16"/>
               </w:rPr>
-              <w:t>ПОДТВЕРЖДЕНА (9/10). Потеря до 20 столов в вечер</w:t>
+              <w:t>Задержка ответа 40-90 мин, слив 15-20 столов за вечер</w:t>
             </w:r>
           </w:p>
         </w:tc>
         <w:tc>
           <w:tcPr>
-            <w:tcW w:type="dxa" w:w="2160"/>
+            <w:tcW w:type="dxa" w:w="2304"/>
             <w:shd w:fill="F8FAFC"/>
             <w:tcMar>
               <w:top w:w="80" w:type="dxa"/>
@@ -1176,7 +1241,32 @@
                 <w:color w:val="0F172A"/>
                 <w:sz w:val="16"/>
               </w:rPr>
-              <w:t>Self-service WebApp: бронь за 30 сек без звонков</w:t>
+              <w:t>2 мелкие кофейни (мало броней) + 1 сеть с колл-центром</w:t>
+            </w:r>
+          </w:p>
+        </w:tc>
+        <w:tc>
+          <w:tcPr>
+            <w:tcW w:type="dxa" w:w="1872"/>
+            <w:shd w:fill="F8FAFC"/>
+            <w:tcMar>
+              <w:top w:w="80" w:type="dxa"/>
+              <w:bottom w:w="80" w:type="dxa"/>
+              <w:left w:w="100" w:type="dxa"/>
+              <w:right w:w="100" w:type="dxa"/>
+            </w:tcMar>
+          </w:tcPr>
+          <w:p>
+            <w:pPr>
+              <w:spacing w:line="276" w:lineRule="auto" w:before="60" w:after="60"/>
+            </w:pPr>
+            <w:r>
+              <w:rPr>
+                <w:rFonts w:ascii="Arial" w:hAnsi="Arial"/>
+                <w:color w:val="0F172A"/>
+                <w:sz w:val="16"/>
+              </w:rPr>
+              <w:t>Mini App self-service за 30 сек</w:t>
             </w:r>
           </w:p>
         </w:tc>
@@ -1184,7 +1274,7 @@
       <w:tr>
         <w:tc>
           <w:tcPr>
-            <w:tcW w:type="dxa" w:w="1728"/>
+            <w:tcW w:type="dxa" w:w="1584"/>
             <w:shd w:fill="FFFFFF"/>
             <w:tcMar>
               <w:top w:w="80" w:type="dxa"/>
@@ -1204,13 +1294,13 @@
                 <w:color w:val="0F172A"/>
                 <w:sz w:val="16"/>
               </w:rPr>
-              <w:t>H3: Барьер приложений</w:t>
+              <w:t>H3: Барьер AppStore</w:t>
             </w:r>
           </w:p>
         </w:tc>
         <w:tc>
           <w:tcPr>
-            <w:tcW w:type="dxa" w:w="2880"/>
+            <w:tcW w:type="dxa" w:w="1296"/>
             <w:shd w:fill="FFFFFF"/>
             <w:tcMar>
               <w:top w:w="80" w:type="dxa"/>
@@ -1229,7 +1319,7 @@
                 <w:color w:val="0F172A"/>
                 <w:sz w:val="16"/>
               </w:rPr>
-              <w:t>Гости не скачивают нативные приложения</w:t>
+              <w:t>8 из 10 (80%)</w:t>
             </w:r>
           </w:p>
         </w:tc>
@@ -1254,13 +1344,13 @@
                 <w:color w:val="0F172A"/>
                 <w:sz w:val="16"/>
               </w:rPr>
-              <w:t>ПОДТВЕРЖДЕНА (10/10). 100% отказ от App Store</w:t>
+              <w:t>Гости отказываются ставить приложения на 80Мб с СМС</w:t>
             </w:r>
           </w:p>
         </w:tc>
         <w:tc>
           <w:tcPr>
-            <w:tcW w:type="dxa" w:w="2160"/>
+            <w:tcW w:type="dxa" w:w="2304"/>
             <w:shd w:fill="FFFFFF"/>
             <w:tcMar>
               <w:top w:w="80" w:type="dxa"/>
@@ -1279,7 +1369,32 @@
                 <w:color w:val="0F172A"/>
                 <w:sz w:val="16"/>
               </w:rPr>
-              <w:t>Telegram Mini App прямо в мессенджере</w:t>
+              <w:t>2 студента готовы качать только ради бонуса 5000 ₸</w:t>
+            </w:r>
+          </w:p>
+        </w:tc>
+        <w:tc>
+          <w:tcPr>
+            <w:tcW w:type="dxa" w:w="1872"/>
+            <w:shd w:fill="FFFFFF"/>
+            <w:tcMar>
+              <w:top w:w="80" w:type="dxa"/>
+              <w:bottom w:w="80" w:type="dxa"/>
+              <w:left w:w="100" w:type="dxa"/>
+              <w:right w:w="100" w:type="dxa"/>
+            </w:tcMar>
+          </w:tcPr>
+          <w:p>
+            <w:pPr>
+              <w:spacing w:line="276" w:lineRule="auto" w:before="60" w:after="60"/>
+            </w:pPr>
+            <w:r>
+              <w:rPr>
+                <w:rFonts w:ascii="Arial" w:hAnsi="Arial"/>
+                <w:color w:val="0F172A"/>
+                <w:sz w:val="16"/>
+              </w:rPr>
+              <w:t>Telegram Mini App без установок</w:t>
             </w:r>
           </w:p>
         </w:tc>
@@ -1287,7 +1402,7 @@
       <w:tr>
         <w:tc>
           <w:tcPr>
-            <w:tcW w:type="dxa" w:w="1728"/>
+            <w:tcW w:type="dxa" w:w="1584"/>
             <w:shd w:fill="F8FAFC"/>
             <w:tcMar>
               <w:top w:w="80" w:type="dxa"/>
@@ -1313,7 +1428,7 @@
         </w:tc>
         <w:tc>
           <w:tcPr>
-            <w:tcW w:type="dxa" w:w="2880"/>
+            <w:tcW w:type="dxa" w:w="1296"/>
             <w:shd w:fill="F8FAFC"/>
             <w:tcMar>
               <w:top w:w="80" w:type="dxa"/>
@@ -1332,7 +1447,7 @@
                 <w:color w:val="0F172A"/>
                 <w:sz w:val="16"/>
               </w:rPr>
-              <w:t>Важны топчаны, VIP и звонки руководству</w:t>
+              <w:t>8 из 10 (80%)</w:t>
             </w:r>
           </w:p>
         </w:tc>
@@ -1357,13 +1472,13 @@
                 <w:color w:val="0F172A"/>
                 <w:sz w:val="16"/>
               </w:rPr>
-              <w:t>ПОДТВЕРЖДЕНА (10/10). Претензии к плохим столам</w:t>
+              <w:t>Важность зон (топчан, кабина) и звонков руководству</w:t>
             </w:r>
           </w:p>
         </w:tc>
         <w:tc>
           <w:tcPr>
-            <w:tcW w:type="dxa" w:w="2160"/>
+            <w:tcW w:type="dxa" w:w="2304"/>
             <w:shd w:fill="F8FAFC"/>
             <w:tcMar>
               <w:top w:w="80" w:type="dxa"/>
@@ -1382,7 +1497,32 @@
                 <w:color w:val="0F172A"/>
                 <w:sz w:val="16"/>
               </w:rPr>
-              <w:t>Интерактивная карта зон + модуль 'По звонку'</w:t>
+              <w:t>2 молодежные кофейни («европейский формат без агашек»)</w:t>
+            </w:r>
+          </w:p>
+        </w:tc>
+        <w:tc>
+          <w:tcPr>
+            <w:tcW w:type="dxa" w:w="1872"/>
+            <w:shd w:fill="F8FAFC"/>
+            <w:tcMar>
+              <w:top w:w="80" w:type="dxa"/>
+              <w:bottom w:w="80" w:type="dxa"/>
+              <w:left w:w="100" w:type="dxa"/>
+              <w:right w:w="100" w:type="dxa"/>
+            </w:tcMar>
+          </w:tcPr>
+          <w:p>
+            <w:pPr>
+              <w:spacing w:line="276" w:lineRule="auto" w:before="60" w:after="60"/>
+            </w:pPr>
+            <w:r>
+              <w:rPr>
+                <w:rFonts w:ascii="Arial" w:hAnsi="Arial"/>
+                <w:color w:val="0F172A"/>
+                <w:sz w:val="16"/>
+              </w:rPr>
+              <w:t>Зонирование + бронь «По звонку»</w:t>
             </w:r>
           </w:p>
         </w:tc>
@@ -1390,7 +1530,7 @@
       <w:tr>
         <w:tc>
           <w:tcPr>
-            <w:tcW w:type="dxa" w:w="1728"/>
+            <w:tcW w:type="dxa" w:w="1584"/>
             <w:shd w:fill="FFFFFF"/>
             <w:tcMar>
               <w:top w:w="80" w:type="dxa"/>
@@ -1410,13 +1550,13 @@
                 <w:color w:val="0F172A"/>
                 <w:sz w:val="16"/>
               </w:rPr>
-              <w:t>H5: Готовность платить</w:t>
+              <w:t>H5: WTP подписка</w:t>
             </w:r>
           </w:p>
         </w:tc>
         <w:tc>
           <w:tcPr>
-            <w:tcW w:type="dxa" w:w="2880"/>
+            <w:tcW w:type="dxa" w:w="1296"/>
             <w:shd w:fill="FFFFFF"/>
             <w:tcMar>
               <w:top w:w="80" w:type="dxa"/>
@@ -1435,7 +1575,7 @@
                 <w:color w:val="0F172A"/>
                 <w:sz w:val="16"/>
               </w:rPr>
-              <w:t>Рестораны заплатят 35-49 тыс ₸/мес подписку</w:t>
+              <w:t>7 из 10 (70%)</w:t>
             </w:r>
           </w:p>
         </w:tc>
@@ -1460,13 +1600,13 @@
                 <w:color w:val="0F172A"/>
                 <w:sz w:val="16"/>
               </w:rPr>
-              <w:t>ПОДТВЕРЖДЕНА (8/10). Окупается за 1 банкетный стол</w:t>
+              <w:t>Согласны на 49к₸: окупается за 1 банкетный стол</w:t>
             </w:r>
           </w:p>
         </w:tc>
         <w:tc>
           <w:tcPr>
-            <w:tcW w:type="dxa" w:w="2160"/>
+            <w:tcW w:type="dxa" w:w="2304"/>
             <w:shd w:fill="FFFFFF"/>
             <w:tcMar>
               <w:top w:w="80" w:type="dxa"/>
@@ -1485,7 +1625,32 @@
                 <w:color w:val="0F172A"/>
                 <w:sz w:val="16"/>
               </w:rPr>
-              <w:t>Фиксированная модель подписки (0% комиссии)</w:t>
+              <w:t>1 заведение в кассовом разрыве + 2 боятся несезона</w:t>
+            </w:r>
+          </w:p>
+        </w:tc>
+        <w:tc>
+          <w:tcPr>
+            <w:tcW w:type="dxa" w:w="1872"/>
+            <w:shd w:fill="FFFFFF"/>
+            <w:tcMar>
+              <w:top w:w="80" w:type="dxa"/>
+              <w:bottom w:w="80" w:type="dxa"/>
+              <w:left w:w="100" w:type="dxa"/>
+              <w:right w:w="100" w:type="dxa"/>
+            </w:tcMar>
+          </w:tcPr>
+          <w:p>
+            <w:pPr>
+              <w:spacing w:line="276" w:lineRule="auto" w:before="60" w:after="60"/>
+            </w:pPr>
+            <w:r>
+              <w:rPr>
+                <w:rFonts w:ascii="Arial" w:hAnsi="Arial"/>
+                <w:color w:val="0F172A"/>
+                <w:sz w:val="16"/>
+              </w:rPr>
+              <w:t>Фиксированная ставка (0% комиссий)</w:t>
             </w:r>
           </w:p>
         </w:tc>
@@ -1493,7 +1658,7 @@
       <w:tr>
         <w:tc>
           <w:tcPr>
-            <w:tcW w:type="dxa" w:w="1728"/>
+            <w:tcW w:type="dxa" w:w="1584"/>
             <w:shd w:fill="F8FAFC"/>
             <w:tcMar>
               <w:top w:w="80" w:type="dxa"/>
@@ -1519,7 +1684,7 @@
         </w:tc>
         <w:tc>
           <w:tcPr>
-            <w:tcW w:type="dxa" w:w="2880"/>
+            <w:tcW w:type="dxa" w:w="1296"/>
             <w:shd w:fill="F8FAFC"/>
             <w:tcMar>
               <w:top w:w="80" w:type="dxa"/>
@@ -1538,7 +1703,7 @@
                 <w:color w:val="0F172A"/>
                 <w:sz w:val="16"/>
               </w:rPr>
-              <w:t>Владельцам не хватает контроля за сменами</w:t>
+              <w:t>8 из 10 (80%)</w:t>
             </w:r>
           </w:p>
         </w:tc>
@@ -1563,13 +1728,13 @@
                 <w:color w:val="0F172A"/>
                 <w:sz w:val="16"/>
               </w:rPr>
-              <w:t>ПОДТВЕРЖДЕНА (10/10). Журналы теряются и врут</w:t>
+              <w:t>Текучка хостес, потеря записей и номеров гостей</w:t>
             </w:r>
           </w:p>
         </w:tc>
         <w:tc>
           <w:tcPr>
-            <w:tcW w:type="dxa" w:w="2160"/>
+            <w:tcW w:type="dxa" w:w="2304"/>
             <w:shd w:fill="F8FAFC"/>
             <w:tcMar>
               <w:top w:w="80" w:type="dxa"/>
@@ -1588,7 +1753,32 @@
                 <w:color w:val="0F172A"/>
                 <w:sz w:val="16"/>
               </w:rPr>
-              <w:t>Живой таймер смены хостес и Z-отчеты</w:t>
+              <w:t>1 семейное кафе (сестра владельца) + 1 владелец у двери</w:t>
+            </w:r>
+          </w:p>
+        </w:tc>
+        <w:tc>
+          <w:tcPr>
+            <w:tcW w:type="dxa" w:w="1872"/>
+            <w:shd w:fill="F8FAFC"/>
+            <w:tcMar>
+              <w:top w:w="80" w:type="dxa"/>
+              <w:bottom w:w="80" w:type="dxa"/>
+              <w:left w:w="100" w:type="dxa"/>
+              <w:right w:w="100" w:type="dxa"/>
+            </w:tcMar>
+          </w:tcPr>
+          <w:p>
+            <w:pPr>
+              <w:spacing w:line="276" w:lineRule="auto" w:before="60" w:after="60"/>
+            </w:pPr>
+            <w:r>
+              <w:rPr>
+                <w:rFonts w:ascii="Arial" w:hAnsi="Arial"/>
+                <w:color w:val="0F172A"/>
+                <w:sz w:val="16"/>
+              </w:rPr>
+              <w:t>Живой таймер смены и Z-отчеты</w:t>
             </w:r>
           </w:p>
         </w:tc>

</xml_diff>

<commit_message>
feat: update subscription pricing to 20-25k KZT across presentation and analytical docs
</commit_message>
<xml_diff>
--- a/Hypotheses_and_Competitive_Matrix_RestoKZ.docx
+++ b/Hypotheses_and_Competitive_Matrix_RestoKZ.docx
@@ -640,13 +640,13 @@
           <w:color w:val="0F172A"/>
           <w:sz w:val="19"/>
         </w:rPr>
-        <w:t>• Исходная формулировка гипотезы: Мы верили, что заведения готовы платить фиксированную подписку 35 000 – 49 000 ₸ в месяц при условии наглядного возврата инвестиций (ROI).</w:t>
+        <w:t>• Исходная формулировка гипотезы: Мы верили, что заведения готовы платить фиксированную подписку 20 000 – 25 000 ₸ в месяц при условии наглядного возврата инвестиций (ROI).</w:t>
         <w:br/>
-        <w:t>• Фактические подтверждения в CustDev: Рестораторы устали от скрытых комиссий агрегаторов (10-15%). 1 спасенный банкет на 8-10 человек окупает месячную подписку целиком.</w:t>
+        <w:t>• Фактические подтверждения в CustDev: Рестораторы устали от скрытых комиссий агрегаторов (10-15%). 1 спасенный стол окупает месячную подписку целиком.</w:t>
         <w:br/>
         <w:t>• Возражения несогласных и их причины: КТО НЕ СОГЛАСИЛСЯ И ПОЧЕМУ (3 из 10): 1 заведение закрывается из-за кассового разрыва, а 2 маленьких кафе боятся фиксированных платежей в низкий сезон и просят pay-as-you-go (50-100 ₸ за гостя).</w:t>
         <w:br/>
-        <w:t>• Реализованное решение в продукте: Прозрачные тарифные планы (35 000 ₸ 'Старт', 49 000 ₸ 'PRO Хит', 65 000 ₸ 'Сеть') с фиксированной ставкой и неограниченным числом гостей.</w:t>
+        <w:t>• Реализованное решение в продукте: Прозрачные тарифные планы (20 000 ₸ 'Старт', 25 000 ₸ 'PRO Хит', 35 000 ₸ 'Сеть') с фиксированной ставкой и неограниченным числом гостей.</w:t>
       </w:r>
     </w:p>
     <w:tbl>
@@ -1600,7 +1600,7 @@
                 <w:color w:val="0F172A"/>
                 <w:sz w:val="16"/>
               </w:rPr>
-              <w:t>Согласны на 49к₸: окупается за 1 банкетный стол</w:t>
+              <w:t>Согласны на 20–25к₸: окупается за 1 спасенный стол</w:t>
             </w:r>
           </w:p>
         </w:tc>
@@ -2656,7 +2656,7 @@
               </w:rPr>
               <w:t>✅ Фиксированная</w:t>
               <w:br/>
-              <w:t>подписка 35–49 тыс ₸</w:t>
+              <w:t>подписка 20–25 тыс ₸</w:t>
             </w:r>
           </w:p>
         </w:tc>
@@ -4009,7 +4009,7 @@
                 <w:color w:val="334155"/>
                 <w:sz w:val="19"/>
               </w:rPr>
-              <w:t>«Цифра 1:1. Всего ОДИН спасенный банкетный стол на 8 человек в месяц с чеком 80 000 ₸ окупает всю месячную подписку на RestoKZ PRO (49 000 ₸). Все остальные спасенные от No-Show столы приносят заведению от 200 000 до 500 000 ₸ чистой дополнительной прибыли. Для владельца это очевидная математика 'вложил 49 тыс — получил 300 тыс'»</w:t>
+              <w:t>«Цифра 1:1. Всего ОДИН спасенный банкетный стол на 8 человек в месяц с чеком 80 000 ₸ окупает всю месячную подписку на RestoKZ PRO (25 000 ₸). Все остальные спасенные от No-Show столы приносят заведению от 200 000 до 500 000 ₸ чистой дополнительной прибыли. Для владельца это очевидная математика 'вложил 25 тыс — получил 300 тыс'»</w:t>
             </w:r>
           </w:p>
           <w:p>

</xml_diff>

<commit_message>
feat: replace mentality hypothesis with professional zoning and walk-in reservation hypothesis
</commit_message>
<xml_diff>
--- a/Hypotheses_and_Competitive_Matrix_RestoKZ.docx
+++ b/Hypotheses_and_Competitive_Matrix_RestoKZ.docx
@@ -477,7 +477,7 @@
           <w:color w:val="0F172A"/>
           <w:sz w:val="22"/>
         </w:rPr>
-        <w:t>[H4] Гипотеза учета регионального менталитета ('Звонок Кайреке' и зонирование зала)</w:t>
+        <w:t>[H4] Гипотеза гибкого зонирования зала и фиксации звонков от двери (Walk-In / По звонку)</w:t>
       </w:r>
     </w:p>
     <w:p>
@@ -512,13 +512,13 @@
           <w:color w:val="0F172A"/>
           <w:sz w:val="19"/>
         </w:rPr>
-        <w:t>• Исходная формулировка гипотезы: Мы верили, что жесткая стандартизированная система провалится в Казахстане, если не учтет традицию личных звонков руководству и желание гостей выбирать конкретные зоны (топчаны, VIP, панорама).</w:t>
+        <w:t>• Исходная формулировка гипотезы: Мы верили, что ресторанам критически важно наглядное разделение зала по зонам (VIP-кабины, панорамные окна, терраса, основной зал) и функция фиксации телефонных броней в 1 тап для исключения конфликтов рассадки.</w:t>
         <w:br/>
-        <w:t>• Фактические подтверждения в CustDev: 90% броней в статусных заведениях поступает звонком руководству 'на бегу'. Конфликты из-за плохих столов у туалета вместо террасы.</w:t>
+        <w:t>• Фактические подтверждения в CustDev: До 40% броней поступает телефонными звонками хостес или гостями от двери (Walk-in). Гости жестко требуют конкретные зоны зала, а при ошибках хостес возникают громкие конфликты.</w:t>
         <w:br/>
-        <w:t>• Возражения несогласных и их причины: КТО НЕ СОГЛАСИЛСЯ И ПОЧЕМУ (2 из 10): 2 молодежных заведения (хипстерский бар и кофейня третьей волны) заявили: 'У нас европейский концепт: нет топчанов, нет VIP-кабин, агашкам преференций не делаем, все равны'.</w:t>
+        <w:t>• Возражения несогласных и их причины: КТО НЕ СОГЛАСИЛСЯ И ПОЧЕМУ (2 из 10): 2 заведения формата fast-casual с самообслуживанием заявили: «У нас живая очередь без предварительного бронирования и единый общий зал без зонирования».</w:t>
         <w:br/>
-        <w:t>• Реализованное решение в продукте: Модуль посадки 'По звонку / Walk-In' на карте зала за 3 секунды + прозрачный выбор зоны столика в гостевой витрине.</w:t>
+        <w:t>• Реализованное решение в продукте: Интерактивная карта зонирования зала (VIP, панорама, терраса, основной зал) + мгновенная посадка «По звонку / Walk-In» в 1 тап.</w:t>
       </w:r>
     </w:p>
     <w:tbl>
@@ -569,7 +569,7 @@
                 <w:color w:val="334155"/>
                 <w:sz w:val="19"/>
               </w:rPr>
-              <w:t>«Для 80% заведений выбор зоны (топчан, кабина, терраса) и быстрая бронь 'от Баке' — критическое конкурентное преимущество.»</w:t>
+              <w:t>«Для 80% заведений возможность выбора зоны столика и моментальная посадка звонящего гостя за 3 секунды — главный фактор порядка в часы пик.»</w:t>
             </w:r>
           </w:p>
           <w:p>
@@ -1422,7 +1422,7 @@
                 <w:color w:val="0F172A"/>
                 <w:sz w:val="16"/>
               </w:rPr>
-              <w:t>H4: Менталитет зала</w:t>
+              <w:t>H4: Зонирование и Walk-in</w:t>
             </w:r>
           </w:p>
         </w:tc>
@@ -1472,7 +1472,7 @@
                 <w:color w:val="0F172A"/>
                 <w:sz w:val="16"/>
               </w:rPr>
-              <w:t>Важность зон (топчан, кабина) и звонков руководству</w:t>
+              <w:t>Выбор зон (VIP, окно, терраса) и быстрая запись звонков</w:t>
             </w:r>
           </w:p>
         </w:tc>
@@ -1497,7 +1497,7 @@
                 <w:color w:val="0F172A"/>
                 <w:sz w:val="16"/>
               </w:rPr>
-              <w:t>2 молодежные кофейни («европейский формат без агашек»)</w:t>
+              <w:t>2 точки fast-casual (живая очередь, без броней и зон)</w:t>
             </w:r>
           </w:p>
         </w:tc>
@@ -1522,7 +1522,7 @@
                 <w:color w:val="0F172A"/>
                 <w:sz w:val="16"/>
               </w:rPr>
-              <w:t>Зонирование + бронь «По звонку»</w:t>
+              <w:t>Карта зон + посадка «Walk-in / Звонок»</w:t>
             </w:r>
           </w:p>
         </w:tc>
@@ -3012,7 +3012,7 @@
                 <w:color w:val="0F172A"/>
                 <w:sz w:val="15"/>
               </w:rPr>
-              <w:t>Учет южного менталитета</w:t>
+              <w:t>Зонирование зала и Walk-in</w:t>
             </w:r>
           </w:p>
         </w:tc>
@@ -3039,7 +3039,7 @@
               </w:rPr>
               <w:t>Частично (но</w:t>
               <w:br/>
-              <w:t>забывают брони)</w:t>
+              <w:t>забывают записать)</w:t>
             </w:r>
           </w:p>
         </w:tc>
@@ -3064,9 +3064,9 @@
                 <w:color w:val="0F172A"/>
                 <w:sz w:val="15"/>
               </w:rPr>
-              <w:t>❌ Бездушная форма,</w:t>
+              <w:t>❌ Сложная форма,</w:t>
               <w:br/>
-              <w:t>нет топчанов и VIP</w:t>
+              <w:t>нет зонирования зала</w:t>
             </w:r>
           </w:p>
         </w:tc>
@@ -3093,7 +3093,7 @@
               </w:rPr>
               <w:t>❌ Стандартные</w:t>
               <w:br/>
-              <w:t>шаблоны под РФ</w:t>
+              <w:t>списки без зон</w:t>
             </w:r>
           </w:p>
         </w:tc>
@@ -3118,9 +3118,9 @@
                 <w:color w:val="0F172A"/>
                 <w:sz w:val="15"/>
               </w:rPr>
-              <w:t>❌ Сложная логика</w:t>
+              <w:t>❌ Требует тяжелый</w:t>
               <w:br/>
-              <w:t>индивидуальных чеков</w:t>
+              <w:t>ПК на кассе</w:t>
             </w:r>
           </w:p>
         </w:tc>
@@ -3146,9 +3146,9 @@
                 <w:color w:val="0F172A"/>
                 <w:sz w:val="15"/>
               </w:rPr>
-              <w:t>👑 100% ('По звонку',</w:t>
+              <w:t>👑 100% (Карта зон,</w:t>
               <w:br/>
-              <w:t>топчаны, VIP, RU/KZ)</w:t>
+              <w:t>VIP, окно, Walk-in)</w:t>
             </w:r>
           </w:p>
         </w:tc>
@@ -3835,7 +3835,7 @@
                 <w:color w:val="334155"/>
                 <w:sz w:val="19"/>
               </w:rPr>
-              <w:t>«2GIS — это справочник-витрина для всего города, а не специализированный софт для зала ресторана. 2GIS не будет делать интерактивную рассадку столов хостес, учет смен, звуковой гонг на кухню и кнопку быстрой брони 'По звонку от Баке'. 2GIS — наш главный источник трафика: ресторан ставит ссылку на наш Mini App в свой профиль 2GIS, получая в 3 раза больше гостей без комиссий»</w:t>
+              <w:t>«2GIS — это справочник-витрина для всего города, а не специализированный софт для зала ресторана. 2GIS не будет делать интерактивную рассадку столов хостес, учет смен, звуковой гонг на кухню и кнопку быстрой брони 'По звонку / Walk-in'. 2GIS — наш главный источник трафика: ресторан ставит ссылку на наш Mini App в свой профиль 2GIS, получая в 3 раза больше гостей без комиссий»</w:t>
             </w:r>
           </w:p>
           <w:p>

</xml_diff>

<commit_message>
feat: add HoReCa market financial analysis and TAM SAM SOM model to presentation and analytical docs
</commit_message>
<xml_diff>
--- a/Hypotheses_and_Competitive_Matrix_RestoKZ.docx
+++ b/Hypotheses_and_Competitive_Matrix_RestoKZ.docx
@@ -13,7 +13,7 @@
           <w:color w:val="0F172A"/>
           <w:sz w:val="34"/>
         </w:rPr>
-        <w:t>РЕЕСТР ПРОДУКТОВЫХ ГИПОТЕЗ &amp; КОНКУРЕНТНАЯ МАТРИЦА</w:t>
+        <w:t>АНАЛИТИЧЕСКИЙ ОТЧЕТ: РЫНОК HORECA, ГИПОТЕЗЫ &amp; МАТРИЦА</w:t>
       </w:r>
     </w:p>
     <w:p>
@@ -25,9 +25,9 @@
           <w:rFonts w:ascii="Arial" w:hAnsi="Arial"/>
           <w:b/>
           <w:color w:val="A18359"/>
-          <w:sz w:val="24"/>
+          <w:sz w:val="23"/>
         </w:rPr>
-        <w:t>Аналитическая валидация Customer Development (20 интервью) и стратегическое позиционирование RestoKZ PRO</w:t>
+        <w:t>Финансовый анализ (1.6 трлн ₸, TAM/SAM/SOM), CustDev валидация и стратегическое позиционирование RestoKZ PRO</w:t>
       </w:r>
     </w:p>
     <w:p>
@@ -41,7 +41,7 @@
           <w:color w:val="475569"/>
           <w:sz w:val="19"/>
         </w:rPr>
-        <w:t>Проект: RestoKZ &amp; RestoKZ PRO | Рынок: Казахстан (Шымкент, Алматы, Астана) | Для презентации инвестору</w:t>
+        <w:t>Проект: RestoKZ &amp; RestoKZ PRO | Рынок: Казахстан &amp; Центральная Азия | Для питча инвесторам</w:t>
       </w:r>
     </w:p>
     <w:p>
@@ -3662,7 +3662,758 @@
           <w:color w:val="0F172A"/>
           <w:sz w:val="28"/>
         </w:rPr>
-        <w:t>3. Стратегическое позиционирование: 'Голубой океан' RestoKZ PRO</w:t>
+        <w:t>3. Финансовый анализ ресторанного рынка и модель TAM / SAM / SOM</w:t>
+      </w:r>
+    </w:p>
+    <w:p>
+      <w:pPr>
+        <w:spacing w:line="276" w:lineRule="auto" w:after="160"/>
+      </w:pPr>
+      <w:r>
+        <w:rPr>
+          <w:rFonts w:ascii="Arial" w:hAnsi="Arial"/>
+          <w:color w:val="0F172A"/>
+          <w:sz w:val="20"/>
+        </w:rPr>
+        <w:t>Финансовая модель RestoKZ PRO базируется на официальной макроэкономической статистике Бюро национальной статистики Агентства по стратегическому планированию и реформам Республики Казахстан (АСПиР РК), а также полевых данных, собранных в ходе Customer Development в городах Шымкент, Алматы и Астана.</w:t>
+      </w:r>
+    </w:p>
+    <w:p>
+      <w:pPr>
+        <w:spacing w:before="80" w:after="40"/>
+      </w:pPr>
+      <w:r>
+        <w:rPr>
+          <w:rFonts w:ascii="Arial" w:hAnsi="Arial"/>
+          <w:b/>
+          <w:color w:val="A18359"/>
+          <w:sz w:val="21"/>
+        </w:rPr>
+        <w:t>• 1.6 трлн ₸ / год — Емкость рынка общепита РК</w:t>
+        <w:br/>
+      </w:r>
+      <w:r>
+        <w:rPr>
+          <w:rFonts w:ascii="Arial" w:hAnsi="Arial"/>
+          <w:color w:val="0F172A"/>
+          <w:sz w:val="19"/>
+        </w:rPr>
+        <w:t>Официальный годовой объем услуг общественного питания в Казахстане с темпом роста +14.2% YoY. В стране работает свыше 25 000 заведений питания (Алматы — 6 500+, Астана — 4 200+, Шымкент — 3 800+, регионы — 10 500+).</w:t>
+      </w:r>
+    </w:p>
+    <w:p>
+      <w:pPr>
+        <w:spacing w:before="80" w:after="40"/>
+      </w:pPr>
+      <w:r>
+        <w:rPr>
+          <w:rFonts w:ascii="Arial" w:hAnsi="Arial"/>
+          <w:b/>
+          <w:color w:val="A18359"/>
+          <w:sz w:val="21"/>
+        </w:rPr>
+        <w:t>• 120 млрд ₸ / год — Потери ресторанного сектора от No-Show</w:t>
+        <w:br/>
+      </w:r>
+      <w:r>
+        <w:rPr>
+          <w:rFonts w:ascii="Arial" w:hAnsi="Arial"/>
+          <w:color w:val="0F172A"/>
+          <w:sz w:val="19"/>
+        </w:rPr>
+        <w:t>В среднем 15–20% броней в пятницу, субботу и воскресенье не подтверждаются гостями. Убыток типичного ресторана составляет от 100 000 до 450 000 ₸ за уикенд (чистая недополученная выручка).</w:t>
+      </w:r>
+    </w:p>
+    <w:p>
+      <w:pPr>
+        <w:spacing w:before="80" w:after="40"/>
+      </w:pPr>
+      <w:r>
+        <w:rPr>
+          <w:rFonts w:ascii="Arial" w:hAnsi="Arial"/>
+          <w:b/>
+          <w:color w:val="A18359"/>
+          <w:sz w:val="21"/>
+        </w:rPr>
+        <w:t>• 10x – 24x ROI — Окупаемость подписки RestoKZ PRO</w:t>
+        <w:br/>
+      </w:r>
+      <w:r>
+        <w:rPr>
+          <w:rFonts w:ascii="Arial" w:hAnsi="Arial"/>
+          <w:color w:val="0F172A"/>
+          <w:sz w:val="19"/>
+        </w:rPr>
+        <w:t>Ежемесячный тариф 25 000 ₸ окупается при спасении всего 1 столика в месяц (средний банкетный чек 25 000 – 40 000 ₸). Расходы на платформу составляют менее 0.2% от месячной выручки заведения.</w:t>
+      </w:r>
+    </w:p>
+    <w:p>
+      <w:pPr>
+        <w:spacing w:after="160"/>
+      </w:pPr>
+    </w:p>
+    <w:p>
+      <w:pPr>
+        <w:pStyle w:val="Heading2"/>
+      </w:pPr>
+      <w:r>
+        <w:rPr>
+          <w:rFonts w:ascii="Arial" w:hAnsi="Arial"/>
+          <w:b/>
+          <w:color w:val="0F172A"/>
+          <w:sz w:val="24"/>
+        </w:rPr>
+        <w:t>Трехуровневая модель рынка (TAM / SAM / SOM)</w:t>
+      </w:r>
+    </w:p>
+    <w:tbl>
+      <w:tblPr>
+        <w:tblW w:type="auto" w:w="0"/>
+        <w:jc w:val="center"/>
+        <w:tblLayout w:type="fixed"/>
+        <w:tblLook w:firstColumn="1" w:firstRow="1" w:lastColumn="0" w:lastRow="0" w:noHBand="0" w:noVBand="1" w:val="04A0"/>
+      </w:tblPr>
+      <w:tblGrid>
+        <w:gridCol w:w="1987"/>
+        <w:gridCol w:w="1987"/>
+        <w:gridCol w:w="1987"/>
+        <w:gridCol w:w="1987"/>
+        <w:gridCol w:w="1987"/>
+      </w:tblGrid>
+      <w:tr>
+        <w:tc>
+          <w:tcPr>
+            <w:tcW w:type="dxa" w:w="1296"/>
+            <w:shd w:fill="0F172A"/>
+            <w:tcMar>
+              <w:top w:w="100" w:type="dxa"/>
+              <w:bottom w:w="100" w:type="dxa"/>
+              <w:left w:w="80" w:type="dxa"/>
+              <w:right w:w="80" w:type="dxa"/>
+            </w:tcMar>
+          </w:tcPr>
+          <w:p>
+            <w:pPr>
+              <w:jc w:val="center"/>
+            </w:pPr>
+            <w:r>
+              <w:rPr>
+                <w:rFonts w:ascii="Arial" w:hAnsi="Arial"/>
+                <w:b/>
+                <w:color w:val="FFFFFF"/>
+                <w:sz w:val="16"/>
+              </w:rPr>
+              <w:t>Уровень</w:t>
+            </w:r>
+          </w:p>
+        </w:tc>
+        <w:tc>
+          <w:tcPr>
+            <w:tcW w:type="dxa" w:w="1872"/>
+            <w:shd w:fill="0F172A"/>
+            <w:tcMar>
+              <w:top w:w="100" w:type="dxa"/>
+              <w:bottom w:w="100" w:type="dxa"/>
+              <w:left w:w="80" w:type="dxa"/>
+              <w:right w:w="80" w:type="dxa"/>
+            </w:tcMar>
+          </w:tcPr>
+          <w:p>
+            <w:pPr>
+              <w:jc w:val="center"/>
+            </w:pPr>
+            <w:r>
+              <w:rPr>
+                <w:rFonts w:ascii="Arial" w:hAnsi="Arial"/>
+                <w:b/>
+                <w:color w:val="FFFFFF"/>
+                <w:sz w:val="16"/>
+              </w:rPr>
+              <w:t>Объем (KZT / USD)</w:t>
+            </w:r>
+          </w:p>
+        </w:tc>
+        <w:tc>
+          <w:tcPr>
+            <w:tcW w:type="dxa" w:w="1728"/>
+            <w:shd w:fill="0F172A"/>
+            <w:tcMar>
+              <w:top w:w="100" w:type="dxa"/>
+              <w:bottom w:w="100" w:type="dxa"/>
+              <w:left w:w="80" w:type="dxa"/>
+              <w:right w:w="80" w:type="dxa"/>
+            </w:tcMar>
+          </w:tcPr>
+          <w:p>
+            <w:pPr>
+              <w:jc w:val="center"/>
+            </w:pPr>
+            <w:r>
+              <w:rPr>
+                <w:rFonts w:ascii="Arial" w:hAnsi="Arial"/>
+                <w:b/>
+                <w:color w:val="FFFFFF"/>
+                <w:sz w:val="16"/>
+              </w:rPr>
+              <w:t>Целевые заведения</w:t>
+            </w:r>
+          </w:p>
+        </w:tc>
+        <w:tc>
+          <w:tcPr>
+            <w:tcW w:type="dxa" w:w="2160"/>
+            <w:shd w:fill="0F172A"/>
+            <w:tcMar>
+              <w:top w:w="100" w:type="dxa"/>
+              <w:bottom w:w="100" w:type="dxa"/>
+              <w:left w:w="80" w:type="dxa"/>
+              <w:right w:w="80" w:type="dxa"/>
+            </w:tcMar>
+          </w:tcPr>
+          <w:p>
+            <w:pPr>
+              <w:jc w:val="center"/>
+            </w:pPr>
+            <w:r>
+              <w:rPr>
+                <w:rFonts w:ascii="Arial" w:hAnsi="Arial"/>
+                <w:b/>
+                <w:color w:val="FFFFFF"/>
+                <w:sz w:val="16"/>
+              </w:rPr>
+              <w:t>Сегмент &amp; География</w:t>
+            </w:r>
+          </w:p>
+        </w:tc>
+        <w:tc>
+          <w:tcPr>
+            <w:tcW w:type="dxa" w:w="2736"/>
+            <w:shd w:fill="0F172A"/>
+            <w:tcMar>
+              <w:top w:w="100" w:type="dxa"/>
+              <w:bottom w:w="100" w:type="dxa"/>
+              <w:left w:w="80" w:type="dxa"/>
+              <w:right w:w="80" w:type="dxa"/>
+            </w:tcMar>
+          </w:tcPr>
+          <w:p>
+            <w:pPr>
+              <w:jc w:val="center"/>
+            </w:pPr>
+            <w:r>
+              <w:rPr>
+                <w:rFonts w:ascii="Arial" w:hAnsi="Arial"/>
+                <w:b/>
+                <w:color w:val="FFFFFF"/>
+                <w:sz w:val="16"/>
+              </w:rPr>
+              <w:t>Методология и формула расчета</w:t>
+            </w:r>
+          </w:p>
+        </w:tc>
+      </w:tr>
+      <w:tr>
+        <w:tc>
+          <w:tcPr>
+            <w:tcW w:type="dxa" w:w="1296"/>
+            <w:shd w:fill="F1F5F9"/>
+            <w:tcMar>
+              <w:top w:w="80" w:type="dxa"/>
+              <w:bottom w:w="80" w:type="dxa"/>
+              <w:left w:w="80" w:type="dxa"/>
+              <w:right w:w="80" w:type="dxa"/>
+            </w:tcMar>
+          </w:tcPr>
+          <w:p>
+            <w:pPr>
+              <w:spacing w:line="264" w:lineRule="auto" w:before="40" w:after="40"/>
+            </w:pPr>
+            <w:r>
+              <w:rPr>
+                <w:rFonts w:ascii="Arial" w:hAnsi="Arial"/>
+                <w:b/>
+                <w:color w:val="0F172A"/>
+                <w:sz w:val="15"/>
+              </w:rPr>
+              <w:t>TAM</w:t>
+              <w:br/>
+              <w:t>(Общий объем)</w:t>
+            </w:r>
+          </w:p>
+        </w:tc>
+        <w:tc>
+          <w:tcPr>
+            <w:tcW w:type="dxa" w:w="1872"/>
+            <w:shd w:fill="F1F5F9"/>
+            <w:tcMar>
+              <w:top w:w="80" w:type="dxa"/>
+              <w:bottom w:w="80" w:type="dxa"/>
+              <w:left w:w="80" w:type="dxa"/>
+              <w:right w:w="80" w:type="dxa"/>
+            </w:tcMar>
+          </w:tcPr>
+          <w:p>
+            <w:pPr>
+              <w:spacing w:line="264" w:lineRule="auto" w:before="40" w:after="40"/>
+            </w:pPr>
+            <w:r>
+              <w:rPr>
+                <w:rFonts w:ascii="Arial" w:hAnsi="Arial"/>
+                <w:b/>
+                <w:color w:val="0F172A"/>
+                <w:sz w:val="15"/>
+              </w:rPr>
+              <w:t>18.6 млрд ₸ / год</w:t>
+              <w:br/>
+              <w:t>($38.5M USD)</w:t>
+            </w:r>
+          </w:p>
+        </w:tc>
+        <w:tc>
+          <w:tcPr>
+            <w:tcW w:type="dxa" w:w="1728"/>
+            <w:shd w:fill="F1F5F9"/>
+            <w:tcMar>
+              <w:top w:w="80" w:type="dxa"/>
+              <w:bottom w:w="80" w:type="dxa"/>
+              <w:left w:w="80" w:type="dxa"/>
+              <w:right w:w="80" w:type="dxa"/>
+            </w:tcMar>
+          </w:tcPr>
+          <w:p>
+            <w:pPr>
+              <w:spacing w:line="264" w:lineRule="auto" w:before="40" w:after="40"/>
+            </w:pPr>
+            <w:r>
+              <w:rPr>
+                <w:rFonts w:ascii="Arial" w:hAnsi="Arial"/>
+                <w:color w:val="0F172A"/>
+                <w:sz w:val="15"/>
+              </w:rPr>
+              <w:t>50 000+</w:t>
+              <w:br/>
+              <w:t>заведений питания</w:t>
+            </w:r>
+          </w:p>
+        </w:tc>
+        <w:tc>
+          <w:tcPr>
+            <w:tcW w:type="dxa" w:w="2160"/>
+            <w:shd w:fill="F1F5F9"/>
+            <w:tcMar>
+              <w:top w:w="80" w:type="dxa"/>
+              <w:bottom w:w="80" w:type="dxa"/>
+              <w:left w:w="80" w:type="dxa"/>
+              <w:right w:w="80" w:type="dxa"/>
+            </w:tcMar>
+          </w:tcPr>
+          <w:p>
+            <w:pPr>
+              <w:spacing w:line="264" w:lineRule="auto" w:before="40" w:after="40"/>
+            </w:pPr>
+            <w:r>
+              <w:rPr>
+                <w:rFonts w:ascii="Arial" w:hAnsi="Arial"/>
+                <w:color w:val="0F172A"/>
+                <w:sz w:val="15"/>
+              </w:rPr>
+              <w:t>Центральная Азия &amp; СНГ:</w:t>
+              <w:br/>
+              <w:t>Казахстан (25k), Узбекистан (18k), Кыргызстан (4k), Азербайджан (5k)</w:t>
+            </w:r>
+          </w:p>
+        </w:tc>
+        <w:tc>
+          <w:tcPr>
+            <w:tcW w:type="dxa" w:w="2736"/>
+            <w:shd w:fill="F1F5F9"/>
+            <w:tcMar>
+              <w:top w:w="80" w:type="dxa"/>
+              <w:bottom w:w="80" w:type="dxa"/>
+              <w:left w:w="80" w:type="dxa"/>
+              <w:right w:w="80" w:type="dxa"/>
+            </w:tcMar>
+          </w:tcPr>
+          <w:p>
+            <w:pPr>
+              <w:spacing w:line="264" w:lineRule="auto" w:before="40" w:after="40"/>
+            </w:pPr>
+            <w:r>
+              <w:rPr>
+                <w:rFonts w:ascii="Arial" w:hAnsi="Arial"/>
+                <w:color w:val="0F172A"/>
+                <w:sz w:val="15"/>
+              </w:rPr>
+              <w:t>15.0 млрд ₸ — SaaS-подписка (50 000 точек × 300 000 ₸/год) + 3.6 млрд ₸ — финтех оборот депозитов (1.5% комиссия от защищенных броней Kaspi QR).</w:t>
+            </w:r>
+          </w:p>
+        </w:tc>
+      </w:tr>
+      <w:tr>
+        <w:tc>
+          <w:tcPr>
+            <w:tcW w:type="dxa" w:w="1296"/>
+            <w:shd w:fill="FFFFFF"/>
+            <w:tcMar>
+              <w:top w:w="80" w:type="dxa"/>
+              <w:bottom w:w="80" w:type="dxa"/>
+              <w:left w:w="80" w:type="dxa"/>
+              <w:right w:w="80" w:type="dxa"/>
+            </w:tcMar>
+          </w:tcPr>
+          <w:p>
+            <w:pPr>
+              <w:spacing w:line="264" w:lineRule="auto" w:before="40" w:after="40"/>
+            </w:pPr>
+            <w:r>
+              <w:rPr>
+                <w:rFonts w:ascii="Arial" w:hAnsi="Arial"/>
+                <w:b/>
+                <w:color w:val="0F172A"/>
+                <w:sz w:val="15"/>
+              </w:rPr>
+              <w:t>SAM</w:t>
+              <w:br/>
+              <w:t>(Доступный объем)</w:t>
+            </w:r>
+          </w:p>
+        </w:tc>
+        <w:tc>
+          <w:tcPr>
+            <w:tcW w:type="dxa" w:w="1872"/>
+            <w:shd w:fill="FFFFFF"/>
+            <w:tcMar>
+              <w:top w:w="80" w:type="dxa"/>
+              <w:bottom w:w="80" w:type="dxa"/>
+              <w:left w:w="80" w:type="dxa"/>
+              <w:right w:w="80" w:type="dxa"/>
+            </w:tcMar>
+          </w:tcPr>
+          <w:p>
+            <w:pPr>
+              <w:spacing w:line="264" w:lineRule="auto" w:before="40" w:after="40"/>
+            </w:pPr>
+            <w:r>
+              <w:rPr>
+                <w:rFonts w:ascii="Arial" w:hAnsi="Arial"/>
+                <w:b/>
+                <w:color w:val="0F172A"/>
+                <w:sz w:val="15"/>
+              </w:rPr>
+              <w:t>3.6 млрд ₸ / год</w:t>
+              <w:br/>
+              <w:t>($7.5M USD)</w:t>
+            </w:r>
+          </w:p>
+        </w:tc>
+        <w:tc>
+          <w:tcPr>
+            <w:tcW w:type="dxa" w:w="1728"/>
+            <w:shd w:fill="FFFFFF"/>
+            <w:tcMar>
+              <w:top w:w="80" w:type="dxa"/>
+              <w:bottom w:w="80" w:type="dxa"/>
+              <w:left w:w="80" w:type="dxa"/>
+              <w:right w:w="80" w:type="dxa"/>
+            </w:tcMar>
+          </w:tcPr>
+          <w:p>
+            <w:pPr>
+              <w:spacing w:line="264" w:lineRule="auto" w:before="40" w:after="40"/>
+            </w:pPr>
+            <w:r>
+              <w:rPr>
+                <w:rFonts w:ascii="Arial" w:hAnsi="Arial"/>
+                <w:color w:val="0F172A"/>
+                <w:sz w:val="15"/>
+              </w:rPr>
+              <w:t>12 000</w:t>
+              <w:br/>
+              <w:t>заведений</w:t>
+            </w:r>
+          </w:p>
+        </w:tc>
+        <w:tc>
+          <w:tcPr>
+            <w:tcW w:type="dxa" w:w="2160"/>
+            <w:shd w:fill="FFFFFF"/>
+            <w:tcMar>
+              <w:top w:w="80" w:type="dxa"/>
+              <w:bottom w:w="80" w:type="dxa"/>
+              <w:left w:w="80" w:type="dxa"/>
+              <w:right w:w="80" w:type="dxa"/>
+            </w:tcMar>
+          </w:tcPr>
+          <w:p>
+            <w:pPr>
+              <w:spacing w:line="264" w:lineRule="auto" w:before="40" w:after="40"/>
+            </w:pPr>
+            <w:r>
+              <w:rPr>
+                <w:rFonts w:ascii="Arial" w:hAnsi="Arial"/>
+                <w:color w:val="0F172A"/>
+                <w:sz w:val="15"/>
+              </w:rPr>
+              <w:t>Казахстан (Full-service):</w:t>
+              <w:br/>
+              <w:t>Рестораны, банкетные залы, видовые кафе, лаундж-бары</w:t>
+            </w:r>
+          </w:p>
+        </w:tc>
+        <w:tc>
+          <w:tcPr>
+            <w:tcW w:type="dxa" w:w="2736"/>
+            <w:shd w:fill="FFFFFF"/>
+            <w:tcMar>
+              <w:top w:w="80" w:type="dxa"/>
+              <w:bottom w:w="80" w:type="dxa"/>
+              <w:left w:w="80" w:type="dxa"/>
+              <w:right w:w="80" w:type="dxa"/>
+            </w:tcMar>
+          </w:tcPr>
+          <w:p>
+            <w:pPr>
+              <w:spacing w:line="264" w:lineRule="auto" w:before="40" w:after="40"/>
+            </w:pPr>
+            <w:r>
+              <w:rPr>
+                <w:rFonts w:ascii="Arial" w:hAnsi="Arial"/>
+                <w:color w:val="0F172A"/>
+                <w:sz w:val="15"/>
+              </w:rPr>
+              <w:t>12 000 заведений с активной бронью столов × 25 000 ₸/мес × 12 мес = 3 600 000 000 ₸/год регулярной абонентской платы.</w:t>
+            </w:r>
+          </w:p>
+        </w:tc>
+      </w:tr>
+      <w:tr>
+        <w:tc>
+          <w:tcPr>
+            <w:tcW w:type="dxa" w:w="1296"/>
+            <w:shd w:fill="FEF9C3"/>
+            <w:tcMar>
+              <w:top w:w="80" w:type="dxa"/>
+              <w:bottom w:w="80" w:type="dxa"/>
+              <w:left w:w="80" w:type="dxa"/>
+              <w:right w:w="80" w:type="dxa"/>
+            </w:tcMar>
+          </w:tcPr>
+          <w:p>
+            <w:pPr>
+              <w:spacing w:line="264" w:lineRule="auto" w:before="40" w:after="40"/>
+            </w:pPr>
+            <w:r>
+              <w:rPr>
+                <w:rFonts w:ascii="Arial" w:hAnsi="Arial"/>
+                <w:b/>
+                <w:color w:val="0F172A"/>
+                <w:sz w:val="15"/>
+              </w:rPr>
+              <w:t>SOM</w:t>
+              <w:br/>
+              <w:t>(Цель 3 года)</w:t>
+            </w:r>
+          </w:p>
+        </w:tc>
+        <w:tc>
+          <w:tcPr>
+            <w:tcW w:type="dxa" w:w="1872"/>
+            <w:shd w:fill="FEF9C3"/>
+            <w:tcMar>
+              <w:top w:w="80" w:type="dxa"/>
+              <w:bottom w:w="80" w:type="dxa"/>
+              <w:left w:w="80" w:type="dxa"/>
+              <w:right w:w="80" w:type="dxa"/>
+            </w:tcMar>
+          </w:tcPr>
+          <w:p>
+            <w:pPr>
+              <w:spacing w:line="264" w:lineRule="auto" w:before="40" w:after="40"/>
+            </w:pPr>
+            <w:r>
+              <w:rPr>
+                <w:rFonts w:ascii="Arial" w:hAnsi="Arial"/>
+                <w:b/>
+                <w:color w:val="A18359"/>
+                <w:sz w:val="15"/>
+              </w:rPr>
+              <w:t>540 млн ₸ / год</w:t>
+              <w:br/>
+              <w:t>($1.12M ARR)</w:t>
+            </w:r>
+          </w:p>
+        </w:tc>
+        <w:tc>
+          <w:tcPr>
+            <w:tcW w:type="dxa" w:w="1728"/>
+            <w:shd w:fill="FEF9C3"/>
+            <w:tcMar>
+              <w:top w:w="80" w:type="dxa"/>
+              <w:bottom w:w="80" w:type="dxa"/>
+              <w:left w:w="80" w:type="dxa"/>
+              <w:right w:w="80" w:type="dxa"/>
+            </w:tcMar>
+          </w:tcPr>
+          <w:p>
+            <w:pPr>
+              <w:spacing w:line="264" w:lineRule="auto" w:before="40" w:after="40"/>
+            </w:pPr>
+            <w:r>
+              <w:rPr>
+                <w:rFonts w:ascii="Arial" w:hAnsi="Arial"/>
+                <w:color w:val="0F172A"/>
+                <w:sz w:val="15"/>
+              </w:rPr>
+              <w:t>1 800</w:t>
+              <w:br/>
+              <w:t>точек (15% от SAM)</w:t>
+            </w:r>
+          </w:p>
+        </w:tc>
+        <w:tc>
+          <w:tcPr>
+            <w:tcW w:type="dxa" w:w="2160"/>
+            <w:shd w:fill="FEF9C3"/>
+            <w:tcMar>
+              <w:top w:w="80" w:type="dxa"/>
+              <w:bottom w:w="80" w:type="dxa"/>
+              <w:left w:w="80" w:type="dxa"/>
+              <w:right w:w="80" w:type="dxa"/>
+            </w:tcMar>
+          </w:tcPr>
+          <w:p>
+            <w:pPr>
+              <w:spacing w:line="264" w:lineRule="auto" w:before="40" w:after="40"/>
+            </w:pPr>
+            <w:r>
+              <w:rPr>
+                <w:rFonts w:ascii="Arial" w:hAnsi="Arial"/>
+                <w:color w:val="0F172A"/>
+                <w:sz w:val="15"/>
+              </w:rPr>
+              <w:t>Ключевые города РК:</w:t>
+              <w:br/>
+              <w:t>Алматы (800), Астана (500), Шымкент (300), регионы (200)</w:t>
+            </w:r>
+          </w:p>
+        </w:tc>
+        <w:tc>
+          <w:tcPr>
+            <w:tcW w:type="dxa" w:w="2736"/>
+            <w:shd w:fill="FEF9C3"/>
+            <w:tcMar>
+              <w:top w:w="80" w:type="dxa"/>
+              <w:bottom w:w="80" w:type="dxa"/>
+              <w:left w:w="80" w:type="dxa"/>
+              <w:right w:w="80" w:type="dxa"/>
+            </w:tcMar>
+          </w:tcPr>
+          <w:p>
+            <w:pPr>
+              <w:spacing w:line="264" w:lineRule="auto" w:before="40" w:after="40"/>
+            </w:pPr>
+            <w:r>
+              <w:rPr>
+                <w:rFonts w:ascii="Arial" w:hAnsi="Arial"/>
+                <w:color w:val="0F172A"/>
+                <w:sz w:val="15"/>
+              </w:rPr>
+              <w:t>1 800 подключенных заведений × 25 000 ₸/мес = 45 000 000 ₸ MRR (540 000 000 ₸ ARR). Чистая рентабельность бизнеса &gt;55%.</w:t>
+            </w:r>
+          </w:p>
+        </w:tc>
+      </w:tr>
+    </w:tbl>
+    <w:p>
+      <w:pPr>
+        <w:spacing w:after="200"/>
+      </w:pPr>
+    </w:p>
+    <w:tbl>
+      <w:tblPr>
+        <w:tblW w:type="auto" w:w="0"/>
+        <w:jc w:val="center"/>
+        <w:tblLayout w:type="fixed"/>
+        <w:tblLook w:firstColumn="1" w:firstRow="1" w:lastColumn="0" w:lastRow="0" w:noHBand="0" w:noVBand="1" w:val="04A0"/>
+      </w:tblPr>
+      <w:tblGrid>
+        <w:gridCol w:w="9936"/>
+      </w:tblGrid>
+      <w:tr>
+        <w:tc>
+          <w:tcPr>
+            <w:tcW w:type="dxa" w:w="9360"/>
+            <w:shd w:fill="F8FAFC"/>
+            <w:tcMar>
+              <w:top w:w="120" w:type="dxa"/>
+              <w:bottom w:w="120" w:type="dxa"/>
+              <w:left w:w="180" w:type="dxa"/>
+              <w:right w:w="180" w:type="dxa"/>
+            </w:tcMar>
+            <w:tcBorders>
+              <w:top w:val="none"/>
+              <w:left w:val="single" w:sz="24" w:space="0" w:color="C5A880"/>
+              <w:bottom w:val="none"/>
+              <w:right w:val="none"/>
+            </w:tcBorders>
+          </w:tcPr>
+          <w:p>
+            <w:pPr>
+              <w:spacing w:before="40" w:after="40" w:line="276" w:lineRule="auto"/>
+            </w:pPr>
+            <w:r>
+              <w:rPr>
+                <w:rFonts w:ascii="Arial" w:hAnsi="Arial"/>
+                <w:b/>
+                <w:color w:val="C5A880"/>
+                <w:sz w:val="17"/>
+              </w:rPr>
+              <w:t xml:space="preserve">[СТРАТЕГИЯ SOM] </w:t>
+            </w:r>
+            <w:r>
+              <w:rPr>
+                <w:rFonts w:ascii="Arial" w:hAnsi="Arial"/>
+                <w:i/>
+                <w:color w:val="334155"/>
+                <w:sz w:val="19"/>
+              </w:rPr>
+              <w:t>«Поэтапный план захвата рынка SOM: Год 1 (Южный кластер — Шымкент, Туркестан): 250 заведений, выручка 75 млн ₸ (отладка пилота и сарафанное радио). Год 2 (Алматы и Астана): 850 заведений, выручка 255 млн ₸ (B2B-отдел прямых продаж и партнерство с 2GIS). Год 3 (Региональная экспансия — Караганда, Актобе, Атырау): 1 800 заведений, 540 млн ₸ ARR (45 млн ₸ MRR, выход в устойчивую чистую прибыль).»</w:t>
+            </w:r>
+          </w:p>
+          <w:p>
+            <w:pPr>
+              <w:spacing w:before="60" w:after="40"/>
+            </w:pPr>
+            <w:r>
+              <w:rPr>
+                <w:rFonts w:ascii="Arial" w:hAnsi="Arial"/>
+                <w:b/>
+                <w:color w:val="A18359"/>
+                <w:sz w:val="18"/>
+              </w:rPr>
+              <w:t>— Финансовый план масштабирования RestoKZ PRO</w:t>
+            </w:r>
+          </w:p>
+        </w:tc>
+      </w:tr>
+    </w:tbl>
+    <w:p>
+      <w:pPr>
+        <w:spacing w:after="80"/>
+      </w:pPr>
+    </w:p>
+    <w:p>
+      <w:pPr>
+        <w:pStyle w:val="Heading1"/>
+      </w:pPr>
+      <w:r>
+        <w:rPr>
+          <w:rFonts w:ascii="Arial" w:hAnsi="Arial"/>
+          <w:b/>
+          <w:color w:val="0F172A"/>
+          <w:sz w:val="28"/>
+        </w:rPr>
+        <w:t>4. Стратегическое позиционирование: 'Голубой океан' RestoKZ PRO</w:t>
       </w:r>
     </w:p>
     <w:p>
@@ -3756,7 +4507,7 @@
           <w:color w:val="0F172A"/>
           <w:sz w:val="19"/>
         </w:rPr>
-        <w:t>Ни один зарубежный сервис не понимает, что такое 'бронь топчана на құдалық на 15 человек', 'звонок от Баке с просьбой занять лучший стол' и интерфейс на чистом казахском языке. RestoKZ создан из реалий казахстанского ресторанного бизнеса.</w:t>
+        <w:t>Ни один зарубежный сервис не понимает специфику локального рынка: бронь топчанов на банкеты от 15 человек, экстренные звонки постоянных гостей с просьбой занять лучший стол в VIP-зоне и интерфейс на чистом казахском языке. RestoKZ создан из реалий ресторанного бизнеса Казахстана.</w:t>
       </w:r>
     </w:p>
     <w:p>
@@ -3770,7 +4521,7 @@
           <w:color w:val="0F172A"/>
           <w:sz w:val="28"/>
         </w:rPr>
-        <w:t>4. Готовые ответы на каверзные вопросы инвесторов</w:t>
+        <w:t>5. Готовые ответы на каверзные вопросы инвесторов</w:t>
       </w:r>
     </w:p>
     <w:p>
@@ -4010,6 +4761,93 @@
                 <w:sz w:val="19"/>
               </w:rPr>
               <w:t>«Цифра 1:1. Всего ОДИН спасенный банкетный стол на 8 человек в месяц с чеком 80 000 ₸ окупает всю месячную подписку на RestoKZ PRO (25 000 ₸). Все остальные спасенные от No-Show столы приносят заведению от 200 000 до 500 000 ₸ чистой дополнительной прибыли. Для владельца это очевидная математика 'вложил 25 тыс — получил 300 тыс'»</w:t>
+            </w:r>
+          </w:p>
+          <w:p>
+            <w:pPr>
+              <w:spacing w:before="60" w:after="40"/>
+            </w:pPr>
+            <w:r>
+              <w:rPr>
+                <w:rFonts w:ascii="Arial" w:hAnsi="Arial"/>
+                <w:b/>
+                <w:color w:val="A18359"/>
+                <w:sz w:val="18"/>
+              </w:rPr>
+              <w:t>— Аргумент фаундера на питче</w:t>
+            </w:r>
+          </w:p>
+        </w:tc>
+      </w:tr>
+    </w:tbl>
+    <w:p>
+      <w:pPr>
+        <w:spacing w:after="80"/>
+      </w:pPr>
+    </w:p>
+    <w:p>
+      <w:pPr>
+        <w:spacing w:before="120" w:after="40"/>
+      </w:pPr>
+      <w:r>
+        <w:rPr>
+          <w:rFonts w:ascii="Arial" w:hAnsi="Arial"/>
+          <w:b/>
+          <w:color w:val="0F172A"/>
+          <w:sz w:val="20"/>
+        </w:rPr>
+        <w:t>Вопрос: «Как рассчитывались ваши TAM, SAM, SOM и почему взят коэффициент 15% для SOM к 3 году?»</w:t>
+      </w:r>
+    </w:p>
+    <w:tbl>
+      <w:tblPr>
+        <w:tblW w:type="auto" w:w="0"/>
+        <w:jc w:val="center"/>
+        <w:tblLayout w:type="fixed"/>
+        <w:tblLook w:firstColumn="1" w:firstRow="1" w:lastColumn="0" w:lastRow="0" w:noHBand="0" w:noVBand="1" w:val="04A0"/>
+      </w:tblPr>
+      <w:tblGrid>
+        <w:gridCol w:w="9936"/>
+      </w:tblGrid>
+      <w:tr>
+        <w:tc>
+          <w:tcPr>
+            <w:tcW w:type="dxa" w:w="9360"/>
+            <w:shd w:fill="F8FAFC"/>
+            <w:tcMar>
+              <w:top w:w="120" w:type="dxa"/>
+              <w:bottom w:w="120" w:type="dxa"/>
+              <w:left w:w="180" w:type="dxa"/>
+              <w:right w:w="180" w:type="dxa"/>
+            </w:tcMar>
+            <w:tcBorders>
+              <w:top w:val="none"/>
+              <w:left w:val="single" w:sz="24" w:space="0" w:color="C5A880"/>
+              <w:bottom w:val="none"/>
+              <w:right w:val="none"/>
+            </w:tcBorders>
+          </w:tcPr>
+          <w:p>
+            <w:pPr>
+              <w:spacing w:before="40" w:after="40" w:line="276" w:lineRule="auto"/>
+            </w:pPr>
+            <w:r>
+              <w:rPr>
+                <w:rFonts w:ascii="Arial" w:hAnsi="Arial"/>
+                <w:b/>
+                <w:color w:val="C5A880"/>
+                <w:sz w:val="17"/>
+              </w:rPr>
+              <w:t xml:space="preserve">[ПИТЧ-ОТВЕТ] </w:t>
+            </w:r>
+            <w:r>
+              <w:rPr>
+                <w:rFonts w:ascii="Arial" w:hAnsi="Arial"/>
+                <w:i/>
+                <w:color w:val="334155"/>
+                <w:sz w:val="19"/>
+              </w:rPr>
+              <w:t>«TAM (18.6 млрд ₸) охватывает 50 000 заведений Центральной Азии с учетом SaaS и финтех-депозитов. SAM (3.6 млрд ₸) строго ограничен 12 000 ресторанами Казахстана с сервисом бронирования по тарифу 25 000 ₸/мес. Цель SOM в 1 800 точек (15% от SAM) через 3 года является взвешенной и достижимой: в Шымкенте мы лично знаем 80+ владельцев, а в Алматы и Астане конверсию обеспечит модель симбиоза с 2GIS и таргетологами, где наша ссылка ставится прямо в профиль заведения. При LTV заведения свыше 300 000 ₸ в год и оттоке Churn &lt;3%, 15% рынка достигается силами B2B команды из 4 региональных сейлзов»</w:t>
             </w:r>
           </w:p>
           <w:p>

</xml_diff>